<commit_message>
Update working hours; bilingual tax invoice
- Hours: Mon–Thu and Sat–Sun 10 AM – 8 PM, Friday closed (EN/AR site
  and stationery footers).
- Tax invoice redesigned in the common UAE bilingual layout: English
  left, Arabic right, shared values in between — title, invoice
  details, customer block, item descriptions, totals, amount in words,
  payment details, terms and signatures all in both languages.

Co-Authored-By: Claude Opus 5.5 <noreply@anthropic.com>
Claude-Session: https://claude.ai/code/session_01Nb24wkBWXqpaMd15a8EnZi
</commit_message>
<xml_diff>
--- a/docs/stationery/Bab-Al-Hidaya-Letterhead.docx
+++ b/docs/stationery/Bab-Al-Hidaya-Letterhead.docx
@@ -351,7 +351,7 @@
       <w:headerReference w:type="default" r:id="rId7"/>
       <w:footerReference w:type="default" r:id="rId8"/>
       <w:pgSz w:w="11906" w:h="16838" w:orient="portrait"/>
-      <w:pgMar w:top="2350" w:right="1000" w:bottom="1500" w:left="1000" w:header="500" w:footer="450" w:gutter="0"/>
+      <w:pgMar w:top="2200" w:right="1000" w:bottom="1300" w:left="1000" w:header="500" w:footer="450" w:gutter="0"/>
       <w:pgNumType/>
       <w:docGrid w:linePitch="360"/>
     </w:sectPr>
@@ -505,6 +505,24 @@
       </w:rPr>
       <w:t xml:space="preserve">www.babalhidaya.com</w:t>
     </w:r>
+    <w:r>
+      <w:rPr>
+        <w:rFonts w:ascii="Arial" w:cs="Arial" w:eastAsia="Arial" w:hAnsi="Arial"/>
+        <w:color w:val="C9A227"/>
+        <w:sz w:val="15"/>
+        <w:szCs w:val="15"/>
+      </w:rPr>
+      <w:t xml:space="preserve">   |   </w:t>
+    </w:r>
+    <w:r>
+      <w:rPr>
+        <w:rFonts w:ascii="Arial" w:cs="Arial" w:eastAsia="Arial" w:hAnsi="Arial"/>
+        <w:color w:val="5A6778"/>
+        <w:sz w:val="15"/>
+        <w:szCs w:val="15"/>
+      </w:rPr>
+      <w:t xml:space="preserve">Sat – Thu: 10 AM – 8 PM  ·  Friday closed</w:t>
+    </w:r>
   </w:p>
   <w:p>
     <w:pPr>
@@ -520,7 +538,7 @@
         <w:szCs w:val="15"/>
         <w:rtl/>
       </w:rPr>
-      <w:t xml:space="preserve">مكتب رقم 109، مصفوت 8، عجمان، الإمارات العربية المتحدة</w:t>
+      <w:t xml:space="preserve">مكتب رقم 109، مصفوت 8، عجمان، الإمارات العربية المتحدة  ·  ساعات العمل: السبت – الخميس، 10 ص – 8 م، الجمعة عطلة</w:t>
     </w:r>
   </w:p>
 </w:ftr>

</xml_diff>